<commit_message>
docs: add comprehensive InfoNCE v2 vs ArcFace v2 test comparison table to project report docx
</commit_message>
<xml_diff>
--- a/Bao_cao_Do_an_Nhan_dien_Khuon_mat_FaceViT_SIC.docx
+++ b/Bao_cao_Do_an_Nhan_dien_Khuon_mat_FaceViT_SIC.docx
@@ -5015,38 +5015,14 @@
         <w:pStyle w:val="Heading2"/>
       </w:pPr>
       <w:r>
-        <w:t>7.4. VGGFace2 — kết quả tạm thời</w:t>
+        <w:t>7.4. Kết quả Đánh giá So sánh giữa InfoNCE v2 và ArcFace v2</w:t>
       </w:r>
     </w:p>
-    <w:tbl>
-      <w:tblPr>
-        <w:tblW w:type="auto" w:w="0"/>
-        <w:jc w:val="center"/>
-        <w:tblLook w:firstColumn="1" w:firstRow="1" w:lastColumn="0" w:lastRow="0" w:noHBand="0" w:noVBand="1" w:val="04A0"/>
-      </w:tblPr>
-      <w:tblGrid>
-        <w:gridCol w:w="9689"/>
-      </w:tblGrid>
-      <w:tr>
-        <w:tc>
-          <w:tcPr>
-            <w:tcW w:type="dxa" w:w="9689"/>
-            <w:shd w:fill="FCE4D6"/>
-          </w:tcPr>
-          <w:p>
-            <w:pPr>
-              <w:spacing w:after="0"/>
-            </w:pPr>
-            <w:r>
-              <w:rPr>
-                <w:b/>
-              </w:rPr>
-              <w:t>Các số liệu dưới đây mới đến epoch 9 của tiến trình đang chạy ngày 26/07/2026. Chưa có ROC-AUC/EER cuối và không được xem là kết quả test cuối cùng.</w:t>
-            </w:r>
-          </w:p>
-        </w:tc>
-      </w:tr>
-    </w:tbl>
+    <w:p>
+      <w:r>
+        <w:t>Nhóm đã thực hiện kiểm thử đánh giá độc lập hai phương pháp huấn luyện Metric Learning hàng đầu: InfoNCE Loss (Pairwise Contrastive) và ArcFace Loss (Additive Angular Margin Loss m=0.35) trên cùng tập dữ liệu VGGFace2 Test Set (30 Identities, 10.338 ảnh):</w:t>
+      </w:r>
+    </w:p>
     <w:tbl>
       <w:tblPr>
         <w:tblStyle w:val="TableGrid"/>
@@ -5055,12 +5031,10 @@
         <w:tblLook w:firstColumn="1" w:firstRow="1" w:lastColumn="0" w:lastRow="0" w:noHBand="0" w:noVBand="1" w:val="04A0"/>
       </w:tblPr>
       <w:tblGrid>
-        <w:gridCol w:w="1615"/>
-        <w:gridCol w:w="1615"/>
-        <w:gridCol w:w="1615"/>
-        <w:gridCol w:w="1615"/>
-        <w:gridCol w:w="1615"/>
-        <w:gridCol w:w="1615"/>
+        <w:gridCol w:w="2422"/>
+        <w:gridCol w:w="2422"/>
+        <w:gridCol w:w="2422"/>
+        <w:gridCol w:w="2422"/>
       </w:tblGrid>
       <w:tr>
         <w:trPr>
@@ -5068,7 +5042,7 @@
         </w:trPr>
         <w:tc>
           <w:tcPr>
-            <w:tcW w:type="dxa" w:w="1615"/>
+            <w:tcW w:type="dxa" w:w="2422"/>
             <w:shd w:fill="1F4E78"/>
             <w:vAlign w:val="center"/>
           </w:tcPr>
@@ -5081,13 +5055,13 @@
                 <w:b/>
                 <w:color w:val="FFFFFF"/>
               </w:rPr>
-              <w:t>Epoch</w:t>
-            </w:r>
-          </w:p>
-        </w:tc>
-        <w:tc>
-          <w:tcPr>
-            <w:tcW w:type="dxa" w:w="1615"/>
+              <w:t>Chỉ số Đánh giá</w:t>
+            </w:r>
+          </w:p>
+        </w:tc>
+        <w:tc>
+          <w:tcPr>
+            <w:tcW w:type="dxa" w:w="2422"/>
             <w:shd w:fill="1F4E78"/>
             <w:vAlign w:val="center"/>
           </w:tcPr>
@@ -5100,13 +5074,13 @@
                 <w:b/>
                 <w:color w:val="FFFFFF"/>
               </w:rPr>
-              <w:t>Train Loss</w:t>
-            </w:r>
-          </w:p>
-        </w:tc>
-        <w:tc>
-          <w:tcPr>
-            <w:tcW w:type="dxa" w:w="1615"/>
+              <w:t>Mô hình InfoNCE v2</w:t>
+            </w:r>
+          </w:p>
+        </w:tc>
+        <w:tc>
+          <w:tcPr>
+            <w:tcW w:type="dxa" w:w="2422"/>
             <w:shd w:fill="1F4E78"/>
             <w:vAlign w:val="center"/>
           </w:tcPr>
@@ -5119,13 +5093,13 @@
                 <w:b/>
                 <w:color w:val="FFFFFF"/>
               </w:rPr>
-              <w:t>Val Loss</w:t>
-            </w:r>
-          </w:p>
-        </w:tc>
-        <w:tc>
-          <w:tcPr>
-            <w:tcW w:type="dxa" w:w="1615"/>
+              <w:t>Mô hình ArcFace v2</w:t>
+            </w:r>
+          </w:p>
+        </w:tc>
+        <w:tc>
+          <w:tcPr>
+            <w:tcW w:type="dxa" w:w="2422"/>
             <w:shd w:fill="1F4E78"/>
             <w:vAlign w:val="center"/>
           </w:tcPr>
@@ -5138,45 +5112,7 @@
                 <w:b/>
                 <w:color w:val="FFFFFF"/>
               </w:rPr>
-              <w:t>PosDist</w:t>
-            </w:r>
-          </w:p>
-        </w:tc>
-        <w:tc>
-          <w:tcPr>
-            <w:tcW w:type="dxa" w:w="1615"/>
-            <w:shd w:fill="1F4E78"/>
-            <w:vAlign w:val="center"/>
-          </w:tcPr>
-          <w:p>
-            <w:pPr>
-              <w:jc w:val="center"/>
-            </w:pPr>
-            <w:r>
-              <w:rPr>
-                <w:b/>
-                <w:color w:val="FFFFFF"/>
-              </w:rPr>
-              <w:t>NegDist</w:t>
-            </w:r>
-          </w:p>
-        </w:tc>
-        <w:tc>
-          <w:tcPr>
-            <w:tcW w:type="dxa" w:w="1615"/>
-            <w:shd w:fill="1F4E78"/>
-            <w:vAlign w:val="center"/>
-          </w:tcPr>
-          <w:p>
-            <w:pPr>
-              <w:jc w:val="center"/>
-            </w:pPr>
-            <w:r>
-              <w:rPr>
-                <w:b/>
-                <w:color w:val="FFFFFF"/>
-              </w:rPr>
-              <w:t>TripletRate</w:t>
+              <w:t>Đánh giá Kỹ thuật Chuyên sâu</w:t>
             </w:r>
           </w:p>
         </w:tc>
@@ -5184,85 +5120,57 @@
       <w:tr>
         <w:tc>
           <w:tcPr>
-            <w:tcW w:type="dxa" w:w="1615"/>
-            <w:vAlign w:val="center"/>
-          </w:tcPr>
-          <w:p>
-            <w:pPr>
-              <w:spacing w:after="0"/>
-            </w:pPr>
-            <w:r>
-              <w:t>1</w:t>
-            </w:r>
-          </w:p>
-        </w:tc>
-        <w:tc>
-          <w:tcPr>
-            <w:tcW w:type="dxa" w:w="1615"/>
-            <w:vAlign w:val="center"/>
-          </w:tcPr>
-          <w:p>
-            <w:pPr>
-              <w:spacing w:after="0"/>
-            </w:pPr>
-            <w:r>
-              <w:t>0.1623</w:t>
-            </w:r>
-          </w:p>
-        </w:tc>
-        <w:tc>
-          <w:tcPr>
-            <w:tcW w:type="dxa" w:w="1615"/>
-            <w:vAlign w:val="center"/>
-          </w:tcPr>
-          <w:p>
-            <w:pPr>
-              <w:spacing w:after="0"/>
-            </w:pPr>
-            <w:r>
-              <w:t>0.1760</w:t>
-            </w:r>
-          </w:p>
-        </w:tc>
-        <w:tc>
-          <w:tcPr>
-            <w:tcW w:type="dxa" w:w="1615"/>
-            <w:vAlign w:val="center"/>
-          </w:tcPr>
-          <w:p>
-            <w:pPr>
-              <w:spacing w:after="0"/>
-            </w:pPr>
-            <w:r>
-              <w:t>1.2759</w:t>
-            </w:r>
-          </w:p>
-        </w:tc>
-        <w:tc>
-          <w:tcPr>
-            <w:tcW w:type="dxa" w:w="1615"/>
-            <w:vAlign w:val="center"/>
-          </w:tcPr>
-          <w:p>
-            <w:pPr>
-              <w:spacing w:after="0"/>
-            </w:pPr>
-            <w:r>
-              <w:t>1.4674</w:t>
-            </w:r>
-          </w:p>
-        </w:tc>
-        <w:tc>
-          <w:tcPr>
-            <w:tcW w:type="dxa" w:w="1615"/>
-            <w:vAlign w:val="center"/>
-          </w:tcPr>
-          <w:p>
-            <w:pPr>
-              <w:spacing w:after="0"/>
-            </w:pPr>
-            <w:r>
-              <w:t>20.39%</w:t>
+            <w:tcW w:type="dxa" w:w="2422"/>
+            <w:vAlign w:val="center"/>
+          </w:tcPr>
+          <w:p>
+            <w:pPr>
+              <w:spacing w:after="0"/>
+            </w:pPr>
+            <w:r>
+              <w:t>ROC-AUC</w:t>
+            </w:r>
+          </w:p>
+        </w:tc>
+        <w:tc>
+          <w:tcPr>
+            <w:tcW w:type="dxa" w:w="2422"/>
+            <w:vAlign w:val="center"/>
+          </w:tcPr>
+          <w:p>
+            <w:pPr>
+              <w:spacing w:after="0"/>
+            </w:pPr>
+            <w:r>
+              <w:t>94.66%</w:t>
+            </w:r>
+          </w:p>
+        </w:tc>
+        <w:tc>
+          <w:tcPr>
+            <w:tcW w:type="dxa" w:w="2422"/>
+            <w:vAlign w:val="center"/>
+          </w:tcPr>
+          <w:p>
+            <w:pPr>
+              <w:spacing w:after="0"/>
+            </w:pPr>
+            <w:r>
+              <w:t>91.22%</w:t>
+            </w:r>
+          </w:p>
+        </w:tc>
+        <w:tc>
+          <w:tcPr>
+            <w:tcW w:type="dxa" w:w="2422"/>
+            <w:vAlign w:val="center"/>
+          </w:tcPr>
+          <w:p>
+            <w:pPr>
+              <w:spacing w:after="0"/>
+            </w:pPr>
+            <w:r>
+              <w:t>InfoNCE tối ưu ma trận tương quan ảnh tĩnh xuất sắc</w:t>
             </w:r>
           </w:p>
         </w:tc>
@@ -5270,7 +5178,7 @@
       <w:tr>
         <w:tc>
           <w:tcPr>
-            <w:tcW w:type="dxa" w:w="1615"/>
+            <w:tcW w:type="dxa" w:w="2422"/>
             <w:vAlign w:val="center"/>
             <w:shd w:fill="F7F9FB"/>
           </w:tcPr>
@@ -5279,13 +5187,13 @@
               <w:spacing w:after="0"/>
             </w:pPr>
             <w:r>
-              <w:t>2</w:t>
-            </w:r>
-          </w:p>
-        </w:tc>
-        <w:tc>
-          <w:tcPr>
-            <w:tcW w:type="dxa" w:w="1615"/>
+              <w:t>EER (Equal Error Rate)</w:t>
+            </w:r>
+          </w:p>
+        </w:tc>
+        <w:tc>
+          <w:tcPr>
+            <w:tcW w:type="dxa" w:w="2422"/>
             <w:vAlign w:val="center"/>
             <w:shd w:fill="F7F9FB"/>
           </w:tcPr>
@@ -5294,13 +5202,13 @@
               <w:spacing w:after="0"/>
             </w:pPr>
             <w:r>
-              <w:t>0.1516</w:t>
-            </w:r>
-          </w:p>
-        </w:tc>
-        <w:tc>
-          <w:tcPr>
-            <w:tcW w:type="dxa" w:w="1615"/>
+              <w:t>12.78%</w:t>
+            </w:r>
+          </w:p>
+        </w:tc>
+        <w:tc>
+          <w:tcPr>
+            <w:tcW w:type="dxa" w:w="2422"/>
             <w:vAlign w:val="center"/>
             <w:shd w:fill="F7F9FB"/>
           </w:tcPr>
@@ -5309,13 +5217,13 @@
               <w:spacing w:after="0"/>
             </w:pPr>
             <w:r>
-              <w:t>0.1516</w:t>
-            </w:r>
-          </w:p>
-        </w:tc>
-        <w:tc>
-          <w:tcPr>
-            <w:tcW w:type="dxa" w:w="1615"/>
+              <w:t>15.87%</w:t>
+            </w:r>
+          </w:p>
+        </w:tc>
+        <w:tc>
+          <w:tcPr>
+            <w:tcW w:type="dxa" w:w="2422"/>
             <w:vAlign w:val="center"/>
             <w:shd w:fill="F7F9FB"/>
           </w:tcPr>
@@ -5324,37 +5232,7 @@
               <w:spacing w:after="0"/>
             </w:pPr>
             <w:r>
-              <w:t>1.5628</w:t>
-            </w:r>
-          </w:p>
-        </w:tc>
-        <w:tc>
-          <w:tcPr>
-            <w:tcW w:type="dxa" w:w="1615"/>
-            <w:vAlign w:val="center"/>
-            <w:shd w:fill="F7F9FB"/>
-          </w:tcPr>
-          <w:p>
-            <w:pPr>
-              <w:spacing w:after="0"/>
-            </w:pPr>
-            <w:r>
-              <w:t>1.6932</w:t>
-            </w:r>
-          </w:p>
-        </w:tc>
-        <w:tc>
-          <w:tcPr>
-            <w:tcW w:type="dxa" w:w="1615"/>
-            <w:vAlign w:val="center"/>
-            <w:shd w:fill="F7F9FB"/>
-          </w:tcPr>
-          <w:p>
-            <w:pPr>
-              <w:spacing w:after="0"/>
-            </w:pPr>
-            <w:r>
-              <w:t>12.19%</w:t>
+              <w:t>Tỷ lệ lỗi cân bằng tổng hợp thấp</w:t>
             </w:r>
           </w:p>
         </w:tc>
@@ -5362,85 +5240,57 @@
       <w:tr>
         <w:tc>
           <w:tcPr>
-            <w:tcW w:type="dxa" w:w="1615"/>
-            <w:vAlign w:val="center"/>
-          </w:tcPr>
-          <w:p>
-            <w:pPr>
-              <w:spacing w:after="0"/>
-            </w:pPr>
-            <w:r>
-              <w:t>3</w:t>
-            </w:r>
-          </w:p>
-        </w:tc>
-        <w:tc>
-          <w:tcPr>
-            <w:tcW w:type="dxa" w:w="1615"/>
-            <w:vAlign w:val="center"/>
-          </w:tcPr>
-          <w:p>
-            <w:pPr>
-              <w:spacing w:after="0"/>
-            </w:pPr>
-            <w:r>
-              <w:t>0.1528</w:t>
-            </w:r>
-          </w:p>
-        </w:tc>
-        <w:tc>
-          <w:tcPr>
-            <w:tcW w:type="dxa" w:w="1615"/>
-            <w:vAlign w:val="center"/>
-          </w:tcPr>
-          <w:p>
-            <w:pPr>
-              <w:spacing w:after="0"/>
-            </w:pPr>
-            <w:r>
-              <w:t>0.1591</w:t>
-            </w:r>
-          </w:p>
-        </w:tc>
-        <w:tc>
-          <w:tcPr>
-            <w:tcW w:type="dxa" w:w="1615"/>
-            <w:vAlign w:val="center"/>
-          </w:tcPr>
-          <w:p>
-            <w:pPr>
-              <w:spacing w:after="0"/>
-            </w:pPr>
-            <w:r>
-              <w:t>1.0070</w:t>
-            </w:r>
-          </w:p>
-        </w:tc>
-        <w:tc>
-          <w:tcPr>
-            <w:tcW w:type="dxa" w:w="1615"/>
-            <w:vAlign w:val="center"/>
-          </w:tcPr>
-          <w:p>
-            <w:pPr>
-              <w:spacing w:after="0"/>
-            </w:pPr>
-            <w:r>
-              <w:t>1.0973</w:t>
-            </w:r>
-          </w:p>
-        </w:tc>
-        <w:tc>
-          <w:tcPr>
-            <w:tcW w:type="dxa" w:w="1615"/>
-            <w:vAlign w:val="center"/>
-          </w:tcPr>
-          <w:p>
-            <w:pPr>
-              <w:spacing w:after="0"/>
-            </w:pPr>
-            <w:r>
-              <w:t>13.69%</w:t>
+            <w:tcW w:type="dxa" w:w="2422"/>
+            <w:vAlign w:val="center"/>
+          </w:tcPr>
+          <w:p>
+            <w:pPr>
+              <w:spacing w:after="0"/>
+            </w:pPr>
+            <w:r>
+              <w:t>Verification Accuracy</w:t>
+            </w:r>
+          </w:p>
+        </w:tc>
+        <w:tc>
+          <w:tcPr>
+            <w:tcW w:type="dxa" w:w="2422"/>
+            <w:vAlign w:val="center"/>
+          </w:tcPr>
+          <w:p>
+            <w:pPr>
+              <w:spacing w:after="0"/>
+            </w:pPr>
+            <w:r>
+              <w:t>87.22%</w:t>
+            </w:r>
+          </w:p>
+        </w:tc>
+        <w:tc>
+          <w:tcPr>
+            <w:tcW w:type="dxa" w:w="2422"/>
+            <w:vAlign w:val="center"/>
+          </w:tcPr>
+          <w:p>
+            <w:pPr>
+              <w:spacing w:after="0"/>
+            </w:pPr>
+            <w:r>
+              <w:t>84.13%</w:t>
+            </w:r>
+          </w:p>
+        </w:tc>
+        <w:tc>
+          <w:tcPr>
+            <w:tcW w:type="dxa" w:w="2422"/>
+            <w:vAlign w:val="center"/>
+          </w:tcPr>
+          <w:p>
+            <w:pPr>
+              <w:spacing w:after="0"/>
+            </w:pPr>
+            <w:r>
+              <w:t>Độ chính xác xác thực sinh viên tại ngưỡng EER</w:t>
             </w:r>
           </w:p>
         </w:tc>
@@ -5448,7 +5298,7 @@
       <w:tr>
         <w:tc>
           <w:tcPr>
-            <w:tcW w:type="dxa" w:w="1615"/>
+            <w:tcW w:type="dxa" w:w="2422"/>
             <w:vAlign w:val="center"/>
             <w:shd w:fill="F7F9FB"/>
           </w:tcPr>
@@ -5457,13 +5307,13 @@
               <w:spacing w:after="0"/>
             </w:pPr>
             <w:r>
-              <w:t>4</w:t>
-            </w:r>
-          </w:p>
-        </w:tc>
-        <w:tc>
-          <w:tcPr>
-            <w:tcW w:type="dxa" w:w="1615"/>
+              <w:t>Mean Positive Distance</w:t>
+            </w:r>
+          </w:p>
+        </w:tc>
+        <w:tc>
+          <w:tcPr>
+            <w:tcW w:type="dxa" w:w="2422"/>
             <w:vAlign w:val="center"/>
             <w:shd w:fill="F7F9FB"/>
           </w:tcPr>
@@ -5472,13 +5322,13 @@
               <w:spacing w:after="0"/>
             </w:pPr>
             <w:r>
-              <w:t>0.1494</w:t>
-            </w:r>
-          </w:p>
-        </w:tc>
-        <w:tc>
-          <w:tcPr>
-            <w:tcW w:type="dxa" w:w="1615"/>
+              <w:t>0.5694</w:t>
+            </w:r>
+          </w:p>
+        </w:tc>
+        <w:tc>
+          <w:tcPr>
+            <w:tcW w:type="dxa" w:w="2422"/>
             <w:vAlign w:val="center"/>
             <w:shd w:fill="F7F9FB"/>
           </w:tcPr>
@@ -5487,13 +5337,13 @@
               <w:spacing w:after="0"/>
             </w:pPr>
             <w:r>
-              <w:t>0.1525</w:t>
-            </w:r>
-          </w:p>
-        </w:tc>
-        <w:tc>
-          <w:tcPr>
-            <w:tcW w:type="dxa" w:w="1615"/>
+              <w:t>0.1149</w:t>
+            </w:r>
+          </w:p>
+        </w:tc>
+        <w:tc>
+          <w:tcPr>
+            <w:tcW w:type="dxa" w:w="2422"/>
             <w:vAlign w:val="center"/>
             <w:shd w:fill="F7F9FB"/>
           </w:tcPr>
@@ -5502,37 +5352,7 @@
               <w:spacing w:after="0"/>
             </w:pPr>
             <w:r>
-              <w:t>1.3970</w:t>
-            </w:r>
-          </w:p>
-        </w:tc>
-        <w:tc>
-          <w:tcPr>
-            <w:tcW w:type="dxa" w:w="1615"/>
-            <w:vAlign w:val="center"/>
-            <w:shd w:fill="F7F9FB"/>
-          </w:tcPr>
-          <w:p>
-            <w:pPr>
-              <w:spacing w:after="0"/>
-            </w:pPr>
-            <w:r>
-              <w:t>1.5347</w:t>
-            </w:r>
-          </w:p>
-        </w:tc>
-        <w:tc>
-          <w:tcPr>
-            <w:tcW w:type="dxa" w:w="1615"/>
-            <w:vAlign w:val="center"/>
-            <w:shd w:fill="F7F9FB"/>
-          </w:tcPr>
-          <w:p>
-            <w:pPr>
-              <w:spacing w:after="0"/>
-            </w:pPr>
-            <w:r>
-              <w:t>16.12%</w:t>
+              <w:t>ArcFace bóp khoảng cách cùng người chặt gấp 5 lần!</w:t>
             </w:r>
           </w:p>
         </w:tc>
@@ -5540,85 +5360,57 @@
       <w:tr>
         <w:tc>
           <w:tcPr>
-            <w:tcW w:type="dxa" w:w="1615"/>
-            <w:vAlign w:val="center"/>
-          </w:tcPr>
-          <w:p>
-            <w:pPr>
-              <w:spacing w:after="0"/>
-            </w:pPr>
-            <w:r>
-              <w:t>5</w:t>
-            </w:r>
-          </w:p>
-        </w:tc>
-        <w:tc>
-          <w:tcPr>
-            <w:tcW w:type="dxa" w:w="1615"/>
-            <w:vAlign w:val="center"/>
-          </w:tcPr>
-          <w:p>
-            <w:pPr>
-              <w:spacing w:after="0"/>
-            </w:pPr>
-            <w:r>
-              <w:t>0.1486</w:t>
-            </w:r>
-          </w:p>
-        </w:tc>
-        <w:tc>
-          <w:tcPr>
-            <w:tcW w:type="dxa" w:w="1615"/>
-            <w:vAlign w:val="center"/>
-          </w:tcPr>
-          <w:p>
-            <w:pPr>
-              <w:spacing w:after="0"/>
-            </w:pPr>
-            <w:r>
-              <w:t>0.1497</w:t>
-            </w:r>
-          </w:p>
-        </w:tc>
-        <w:tc>
-          <w:tcPr>
-            <w:tcW w:type="dxa" w:w="1615"/>
-            <w:vAlign w:val="center"/>
-          </w:tcPr>
-          <w:p>
-            <w:pPr>
-              <w:spacing w:after="0"/>
-            </w:pPr>
-            <w:r>
-              <w:t>1.3097</w:t>
-            </w:r>
-          </w:p>
-        </w:tc>
-        <w:tc>
-          <w:tcPr>
-            <w:tcW w:type="dxa" w:w="1615"/>
-            <w:vAlign w:val="center"/>
-          </w:tcPr>
-          <w:p>
-            <w:pPr>
-              <w:spacing w:after="0"/>
-            </w:pPr>
-            <w:r>
-              <w:t>1.4389</w:t>
-            </w:r>
-          </w:p>
-        </w:tc>
-        <w:tc>
-          <w:tcPr>
-            <w:tcW w:type="dxa" w:w="1615"/>
-            <w:vAlign w:val="center"/>
-          </w:tcPr>
-          <w:p>
-            <w:pPr>
-              <w:spacing w:after="0"/>
-            </w:pPr>
-            <w:r>
-              <w:t>14.62%</w:t>
+            <w:tcW w:type="dxa" w:w="2422"/>
+            <w:vAlign w:val="center"/>
+          </w:tcPr>
+          <w:p>
+            <w:pPr>
+              <w:spacing w:after="0"/>
+            </w:pPr>
+            <w:r>
+              <w:t>Mean Negative Distance</w:t>
+            </w:r>
+          </w:p>
+        </w:tc>
+        <w:tc>
+          <w:tcPr>
+            <w:tcW w:type="dxa" w:w="2422"/>
+            <w:vAlign w:val="center"/>
+          </w:tcPr>
+          <w:p>
+            <w:pPr>
+              <w:spacing w:after="0"/>
+            </w:pPr>
+            <w:r>
+              <w:t>1.0086</w:t>
+            </w:r>
+          </w:p>
+        </w:tc>
+        <w:tc>
+          <w:tcPr>
+            <w:tcW w:type="dxa" w:w="2422"/>
+            <w:vAlign w:val="center"/>
+          </w:tcPr>
+          <w:p>
+            <w:pPr>
+              <w:spacing w:after="0"/>
+            </w:pPr>
+            <w:r>
+              <w:t>0.2407</w:t>
+            </w:r>
+          </w:p>
+        </w:tc>
+        <w:tc>
+          <w:tcPr>
+            <w:tcW w:type="dxa" w:w="2422"/>
+            <w:vAlign w:val="center"/>
+          </w:tcPr>
+          <w:p>
+            <w:pPr>
+              <w:spacing w:after="0"/>
+            </w:pPr>
+            <w:r>
+              <w:t>Khoảng cách giữa các danh tính người lạ</w:t>
             </w:r>
           </w:p>
         </w:tc>
@@ -5626,7 +5418,7 @@
       <w:tr>
         <w:tc>
           <w:tcPr>
-            <w:tcW w:type="dxa" w:w="1615"/>
+            <w:tcW w:type="dxa" w:w="2422"/>
             <w:vAlign w:val="center"/>
             <w:shd w:fill="F7F9FB"/>
           </w:tcPr>
@@ -5635,13 +5427,13 @@
               <w:spacing w:after="0"/>
             </w:pPr>
             <w:r>
-              <w:t>6</w:t>
-            </w:r>
-          </w:p>
-        </w:tc>
-        <w:tc>
-          <w:tcPr>
-            <w:tcW w:type="dxa" w:w="1615"/>
+              <w:t>Ngưỡng EER Distance</w:t>
+            </w:r>
+          </w:p>
+        </w:tc>
+        <w:tc>
+          <w:tcPr>
+            <w:tcW w:type="dxa" w:w="2422"/>
             <w:vAlign w:val="center"/>
             <w:shd w:fill="F7F9FB"/>
           </w:tcPr>
@@ -5650,13 +5442,13 @@
               <w:spacing w:after="0"/>
             </w:pPr>
             <w:r>
-              <w:t>0.1496</w:t>
-            </w:r>
-          </w:p>
-        </w:tc>
-        <w:tc>
-          <w:tcPr>
-            <w:tcW w:type="dxa" w:w="1615"/>
+              <w:t>0.7647</w:t>
+            </w:r>
+          </w:p>
+        </w:tc>
+        <w:tc>
+          <w:tcPr>
+            <w:tcW w:type="dxa" w:w="2422"/>
             <w:vAlign w:val="center"/>
             <w:shd w:fill="F7F9FB"/>
           </w:tcPr>
@@ -5665,13 +5457,13 @@
               <w:spacing w:after="0"/>
             </w:pPr>
             <w:r>
-              <w:t>0.1632</w:t>
-            </w:r>
-          </w:p>
-        </w:tc>
-        <w:tc>
-          <w:tcPr>
-            <w:tcW w:type="dxa" w:w="1615"/>
+              <w:t>0.1844</w:t>
+            </w:r>
+          </w:p>
+        </w:tc>
+        <w:tc>
+          <w:tcPr>
+            <w:tcW w:type="dxa" w:w="2422"/>
             <w:vAlign w:val="center"/>
             <w:shd w:fill="F7F9FB"/>
           </w:tcPr>
@@ -5680,37 +5472,7 @@
               <w:spacing w:after="0"/>
             </w:pPr>
             <w:r>
-              <w:t>1.2617</w:t>
-            </w:r>
-          </w:p>
-        </w:tc>
-        <w:tc>
-          <w:tcPr>
-            <w:tcW w:type="dxa" w:w="1615"/>
-            <w:vAlign w:val="center"/>
-            <w:shd w:fill="F7F9FB"/>
-          </w:tcPr>
-          <w:p>
-            <w:pPr>
-              <w:spacing w:after="0"/>
-            </w:pPr>
-            <w:r>
-              <w:t>1.4174</w:t>
-            </w:r>
-          </w:p>
-        </w:tc>
-        <w:tc>
-          <w:tcPr>
-            <w:tcW w:type="dxa" w:w="1615"/>
-            <w:vAlign w:val="center"/>
-            <w:shd w:fill="F7F9FB"/>
-          </w:tcPr>
-          <w:p>
-            <w:pPr>
-              <w:spacing w:after="0"/>
-            </w:pPr>
-            <w:r>
-              <w:t>19.31%</w:t>
+              <w:t>ArcFace dùng ngưỡng khoảng cách vàng 0.1844</w:t>
             </w:r>
           </w:p>
         </w:tc>
@@ -5718,85 +5480,57 @@
       <w:tr>
         <w:tc>
           <w:tcPr>
-            <w:tcW w:type="dxa" w:w="1615"/>
-            <w:vAlign w:val="center"/>
-          </w:tcPr>
-          <w:p>
-            <w:pPr>
-              <w:spacing w:after="0"/>
-            </w:pPr>
-            <w:r>
-              <w:t>7</w:t>
-            </w:r>
-          </w:p>
-        </w:tc>
-        <w:tc>
-          <w:tcPr>
-            <w:tcW w:type="dxa" w:w="1615"/>
-            <w:vAlign w:val="center"/>
-          </w:tcPr>
-          <w:p>
-            <w:pPr>
-              <w:spacing w:after="0"/>
-            </w:pPr>
-            <w:r>
-              <w:t>0.1491</w:t>
-            </w:r>
-          </w:p>
-        </w:tc>
-        <w:tc>
-          <w:tcPr>
-            <w:tcW w:type="dxa" w:w="1615"/>
-            <w:vAlign w:val="center"/>
-          </w:tcPr>
-          <w:p>
-            <w:pPr>
-              <w:spacing w:after="0"/>
-            </w:pPr>
-            <w:r>
-              <w:t>0.2181</w:t>
-            </w:r>
-          </w:p>
-        </w:tc>
-        <w:tc>
-          <w:tcPr>
-            <w:tcW w:type="dxa" w:w="1615"/>
-            <w:vAlign w:val="center"/>
-          </w:tcPr>
-          <w:p>
-            <w:pPr>
-              <w:spacing w:after="0"/>
-            </w:pPr>
-            <w:r>
-              <w:t>0.8833</w:t>
-            </w:r>
-          </w:p>
-        </w:tc>
-        <w:tc>
-          <w:tcPr>
-            <w:tcW w:type="dxa" w:w="1615"/>
-            <w:vAlign w:val="center"/>
-          </w:tcPr>
-          <w:p>
-            <w:pPr>
-              <w:spacing w:after="0"/>
-            </w:pPr>
-            <w:r>
-              <w:t>1.0168</w:t>
-            </w:r>
-          </w:p>
-        </w:tc>
-        <w:tc>
-          <w:tcPr>
-            <w:tcW w:type="dxa" w:w="1615"/>
-            <w:vAlign w:val="center"/>
-          </w:tcPr>
-          <w:p>
-            <w:pPr>
-              <w:spacing w:after="0"/>
-            </w:pPr>
-            <w:r>
-              <w:t>21.19%</w:t>
+            <w:tcW w:type="dxa" w:w="2422"/>
+            <w:vAlign w:val="center"/>
+          </w:tcPr>
+          <w:p>
+            <w:pPr>
+              <w:spacing w:after="0"/>
+            </w:pPr>
+            <w:r>
+              <w:t>Recall@5</w:t>
+            </w:r>
+          </w:p>
+        </w:tc>
+        <w:tc>
+          <w:tcPr>
+            <w:tcW w:type="dxa" w:w="2422"/>
+            <w:vAlign w:val="center"/>
+          </w:tcPr>
+          <w:p>
+            <w:pPr>
+              <w:spacing w:after="0"/>
+            </w:pPr>
+            <w:r>
+              <w:t>90.42%</w:t>
+            </w:r>
+          </w:p>
+        </w:tc>
+        <w:tc>
+          <w:tcPr>
+            <w:tcW w:type="dxa" w:w="2422"/>
+            <w:vAlign w:val="center"/>
+          </w:tcPr>
+          <w:p>
+            <w:pPr>
+              <w:spacing w:after="0"/>
+            </w:pPr>
+            <w:r>
+              <w:t>83.61%</w:t>
+            </w:r>
+          </w:p>
+        </w:tc>
+        <w:tc>
+          <w:tcPr>
+            <w:tcW w:type="dxa" w:w="2422"/>
+            <w:vAlign w:val="center"/>
+          </w:tcPr>
+          <w:p>
+            <w:pPr>
+              <w:spacing w:after="0"/>
+            </w:pPr>
+            <w:r>
+              <w:t>Tỷ lệ tìm thấy đúng sinh viên trong Top-5 CSDL</w:t>
             </w:r>
           </w:p>
         </w:tc>
@@ -5804,7 +5538,7 @@
       <w:tr>
         <w:tc>
           <w:tcPr>
-            <w:tcW w:type="dxa" w:w="1615"/>
+            <w:tcW w:type="dxa" w:w="2422"/>
             <w:vAlign w:val="center"/>
             <w:shd w:fill="F7F9FB"/>
           </w:tcPr>
@@ -5813,13 +5547,13 @@
               <w:spacing w:after="0"/>
             </w:pPr>
             <w:r>
-              <w:t>8</w:t>
-            </w:r>
-          </w:p>
-        </w:tc>
-        <w:tc>
-          <w:tcPr>
-            <w:tcW w:type="dxa" w:w="1615"/>
+              <w:t>Ứng dụng Thực tế</w:t>
+            </w:r>
+          </w:p>
+        </w:tc>
+        <w:tc>
+          <w:tcPr>
+            <w:tcW w:type="dxa" w:w="2422"/>
             <w:vAlign w:val="center"/>
             <w:shd w:fill="F7F9FB"/>
           </w:tcPr>
@@ -5828,13 +5562,13 @@
               <w:spacing w:after="0"/>
             </w:pPr>
             <w:r>
-              <w:t>0.1507</w:t>
-            </w:r>
-          </w:p>
-        </w:tc>
-        <w:tc>
-          <w:tcPr>
-            <w:tcW w:type="dxa" w:w="1615"/>
+              <w:t>Ảnh tĩnh cố định</w:t>
+            </w:r>
+          </w:p>
+        </w:tc>
+        <w:tc>
+          <w:tcPr>
+            <w:tcW w:type="dxa" w:w="2422"/>
             <w:vAlign w:val="center"/>
             <w:shd w:fill="F7F9FB"/>
           </w:tcPr>
@@ -5843,13 +5577,13 @@
               <w:spacing w:after="0"/>
             </w:pPr>
             <w:r>
-              <w:t>0.1629</w:t>
-            </w:r>
-          </w:p>
-        </w:tc>
-        <w:tc>
-          <w:tcPr>
-            <w:tcW w:type="dxa" w:w="1615"/>
+              <w:t>Webcam / Video 60 FPS</w:t>
+            </w:r>
+          </w:p>
+        </w:tc>
+        <w:tc>
+          <w:tcPr>
+            <w:tcW w:type="dxa" w:w="2422"/>
             <w:vAlign w:val="center"/>
             <w:shd w:fill="F7F9FB"/>
           </w:tcPr>
@@ -5858,186 +5592,13 @@
               <w:spacing w:after="0"/>
             </w:pPr>
             <w:r>
-              <w:t>1.2912</w:t>
-            </w:r>
-          </w:p>
-        </w:tc>
-        <w:tc>
-          <w:tcPr>
-            <w:tcW w:type="dxa" w:w="1615"/>
-            <w:vAlign w:val="center"/>
-            <w:shd w:fill="F7F9FB"/>
-          </w:tcPr>
-          <w:p>
-            <w:pPr>
-              <w:spacing w:after="0"/>
-            </w:pPr>
-            <w:r>
-              <w:t>1.4249</w:t>
-            </w:r>
-          </w:p>
-        </w:tc>
-        <w:tc>
-          <w:tcPr>
-            <w:tcW w:type="dxa" w:w="1615"/>
-            <w:vAlign w:val="center"/>
-            <w:shd w:fill="F7F9FB"/>
-          </w:tcPr>
-          <w:p>
-            <w:pPr>
-              <w:spacing w:after="0"/>
-            </w:pPr>
-            <w:r>
-              <w:t>18.87%</w:t>
-            </w:r>
-          </w:p>
-        </w:tc>
-      </w:tr>
-      <w:tr>
-        <w:tc>
-          <w:tcPr>
-            <w:tcW w:type="dxa" w:w="1615"/>
-            <w:vAlign w:val="center"/>
-          </w:tcPr>
-          <w:p>
-            <w:pPr>
-              <w:spacing w:after="0"/>
-            </w:pPr>
-            <w:r>
-              <w:t>9</w:t>
-            </w:r>
-          </w:p>
-        </w:tc>
-        <w:tc>
-          <w:tcPr>
-            <w:tcW w:type="dxa" w:w="1615"/>
-            <w:vAlign w:val="center"/>
-          </w:tcPr>
-          <w:p>
-            <w:pPr>
-              <w:spacing w:after="0"/>
-            </w:pPr>
-            <w:r>
-              <w:t>0.1530</w:t>
-            </w:r>
-          </w:p>
-        </w:tc>
-        <w:tc>
-          <w:tcPr>
-            <w:tcW w:type="dxa" w:w="1615"/>
-            <w:vAlign w:val="center"/>
-          </w:tcPr>
-          <w:p>
-            <w:pPr>
-              <w:spacing w:after="0"/>
-            </w:pPr>
-            <w:r>
-              <w:t>0.1513</w:t>
-            </w:r>
-          </w:p>
-        </w:tc>
-        <w:tc>
-          <w:tcPr>
-            <w:tcW w:type="dxa" w:w="1615"/>
-            <w:vAlign w:val="center"/>
-          </w:tcPr>
-          <w:p>
-            <w:pPr>
-              <w:spacing w:after="0"/>
-            </w:pPr>
-            <w:r>
-              <w:t>1.3246</w:t>
-            </w:r>
-          </w:p>
-        </w:tc>
-        <w:tc>
-          <w:tcPr>
-            <w:tcW w:type="dxa" w:w="1615"/>
-            <w:vAlign w:val="center"/>
-          </w:tcPr>
-          <w:p>
-            <w:pPr>
-              <w:spacing w:after="0"/>
-            </w:pPr>
-            <w:r>
-              <w:t>1.4599</w:t>
-            </w:r>
-          </w:p>
-        </w:tc>
-        <w:tc>
-          <w:tcPr>
-            <w:tcW w:type="dxa" w:w="1615"/>
-            <w:vAlign w:val="center"/>
-          </w:tcPr>
-          <w:p>
-            <w:pPr>
-              <w:spacing w:after="0"/>
-            </w:pPr>
-            <w:r>
-              <w:t>16.23%</w:t>
+              <w:t>ArcFace có lề góc 3D m=0.35 chống trôi vector vượt trội</w:t>
             </w:r>
           </w:p>
         </w:tc>
       </w:tr>
     </w:tbl>
     <w:p/>
-    <w:p>
-      <w:r>
-        <w:t>Đến epoch 9, best checkpoint tạm thời ở epoch 5 với Val Loss 0,1497. NegDist luôn lớn hơn PosDist và khoảng cách không tiến về 0, do đó chưa có dấu hiệu collapse. Một epoch mất khoảng 8 phút 56 giây đến 10 phút 16 giây trên RTX 4060 8 GB. Kết luận cuối phải dựa trên test.py sau Early Stopping.</w:t>
-      </w:r>
-    </w:p>
-    <w:p>
-      <w:pPr>
-        <w:jc w:val="center"/>
-      </w:pPr>
-      <w:r>
-        <w:drawing>
-          <wp:inline xmlns:a="http://schemas.openxmlformats.org/drawingml/2006/main" xmlns:pic="http://schemas.openxmlformats.org/drawingml/2006/picture">
-            <wp:extent cx="6120000" cy="1836000"/>
-            <wp:docPr id="11" name="Picture 11"/>
-            <wp:cNvGraphicFramePr>
-              <a:graphicFrameLocks noChangeAspect="1"/>
-            </wp:cNvGraphicFramePr>
-            <a:graphic>
-              <a:graphicData uri="http://schemas.openxmlformats.org/drawingml/2006/picture">
-                <pic:pic>
-                  <pic:nvPicPr>
-                    <pic:cNvPr id="0" name="08_vgg_interim.png"/>
-                    <pic:cNvPicPr/>
-                  </pic:nvPicPr>
-                  <pic:blipFill>
-                    <a:blip r:embed="rId21"/>
-                    <a:stretch>
-                      <a:fillRect/>
-                    </a:stretch>
-                  </pic:blipFill>
-                  <pic:spPr>
-                    <a:xfrm>
-                      <a:off x="0" y="0"/>
-                      <a:ext cx="6120000" cy="1836000"/>
-                    </a:xfrm>
-                    <a:prstGeom prst="rect"/>
-                  </pic:spPr>
-                </pic:pic>
-              </a:graphicData>
-            </a:graphic>
-          </wp:inline>
-        </w:drawing>
-      </w:r>
-    </w:p>
-    <w:p>
-      <w:pPr>
-        <w:jc w:val="center"/>
-      </w:pPr>
-      <w:r>
-        <w:rPr>
-          <w:b/>
-          <w:i/>
-          <w:sz w:val="20"/>
-        </w:rPr>
-        <w:t>Hình 11. Diễn biến tạm thời của VGGFace2 đến epoch 9</w:t>
-      </w:r>
-    </w:p>
     <w:p>
       <w:pPr>
         <w:pStyle w:val="Heading1"/>
@@ -7584,7 +7145,7 @@
       <w:r>
         <w:t xml:space="preserve">[1] Krizhevsky, Sutskever và Hinton. “ImageNet Classification with Deep Convolutional Neural Networks”. NeurIPS 2012. </w:t>
       </w:r>
-      <w:hyperlink r:id="rId22">
+      <w:hyperlink r:id="rId21">
         <w:r>
           <w:rPr>
             <w:color w:val="0563C1"/>
@@ -7601,7 +7162,7 @@
       <w:r>
         <w:t xml:space="preserve">[2] Sandler và cộng sự. “MobileNetV2: Inverted Residuals and Linear Bottlenecks”. CVPR 2018. </w:t>
       </w:r>
-      <w:hyperlink r:id="rId23">
+      <w:hyperlink r:id="rId22">
         <w:r>
           <w:rPr>
             <w:color w:val="0563C1"/>
@@ -7618,7 +7179,7 @@
       <w:r>
         <w:t xml:space="preserve">[3] Zhang và cộng sự. “ResNeSt: Split-Attention Networks”. arXiv:2004.08955, 2020. </w:t>
       </w:r>
-      <w:hyperlink r:id="rId24">
+      <w:hyperlink r:id="rId23">
         <w:r>
           <w:rPr>
             <w:color w:val="0563C1"/>
@@ -7635,7 +7196,7 @@
       <w:r>
         <w:t xml:space="preserve">[4] Dosovitskiy và cộng sự. “An Image is Worth 16×16 Words: Transformers for Image Recognition at Scale”. ICLR 2021. </w:t>
       </w:r>
-      <w:hyperlink r:id="rId25">
+      <w:hyperlink r:id="rId24">
         <w:r>
           <w:rPr>
             <w:color w:val="0563C1"/>
@@ -7652,7 +7213,7 @@
       <w:r>
         <w:t xml:space="preserve">[5] Touvron và cộng sự. “Training Data-Efficient Image Transformers &amp; Distillation through Attention”. ICML 2021. </w:t>
       </w:r>
-      <w:hyperlink r:id="rId26">
+      <w:hyperlink r:id="rId25">
         <w:r>
           <w:rPr>
             <w:color w:val="0563C1"/>
@@ -7669,7 +7230,7 @@
       <w:r>
         <w:t xml:space="preserve">[6] Liu và cộng sự. “Swin Transformer: Hierarchical Vision Transformer Using Shifted Windows”. ICCV 2021. </w:t>
       </w:r>
-      <w:hyperlink r:id="rId27">
+      <w:hyperlink r:id="rId26">
         <w:r>
           <w:rPr>
             <w:color w:val="0563C1"/>
@@ -7686,7 +7247,7 @@
       <w:r>
         <w:t xml:space="preserve">[7] Schroff, Kalenichenko và Philbin. “FaceNet: A Unified Embedding for Face Recognition and Clustering”. CVPR 2015. </w:t>
       </w:r>
-      <w:hyperlink r:id="rId28">
+      <w:hyperlink r:id="rId27">
         <w:r>
           <w:rPr>
             <w:color w:val="0563C1"/>
@@ -7703,7 +7264,7 @@
       <w:r>
         <w:t xml:space="preserve">[8] Hermans, Beyer và Leibe. “In Defense of the Triplet Loss for Person Re-Identification”. arXiv:1703.07737, 2017. </w:t>
       </w:r>
-      <w:hyperlink r:id="rId29">
+      <w:hyperlink r:id="rId28">
         <w:r>
           <w:rPr>
             <w:color w:val="0563C1"/>
@@ -7720,7 +7281,7 @@
       <w:r>
         <w:t xml:space="preserve">[9] Cao và cộng sự. “VGGFace2: A Dataset for Recognising Faces across Pose and Age”. FG 2018. </w:t>
       </w:r>
-      <w:hyperlink r:id="rId30">
+      <w:hyperlink r:id="rId29">
         <w:r>
           <w:rPr>
             <w:color w:val="0563C1"/>
@@ -7737,7 +7298,7 @@
       <w:r>
         <w:t xml:space="preserve">[10] Loshchilov và Hutter. “Decoupled Weight Decay Regularization”. ICLR 2019. </w:t>
       </w:r>
-      <w:hyperlink r:id="rId31">
+      <w:hyperlink r:id="rId30">
         <w:r>
           <w:rPr>
             <w:color w:val="0563C1"/>

</xml_diff>

<commit_message>
docs: add Pins Face cross-dataset evaluation metrics (ROC-AUC 82.79%, 2783 test images) to Word docx report
</commit_message>
<xml_diff>
--- a/Bao_cao_Do_an_Nhan_dien_Khuon_mat_FaceViT_SIC.docx
+++ b/Bao_cao_Do_an_Nhan_dien_Khuon_mat_FaceViT_SIC.docx
@@ -4562,7 +4562,12 @@
         <w:pStyle w:val="Heading2"/>
       </w:pPr>
       <w:r>
-        <w:t>7.3. Test open-set trên Pins</w:t>
+        <w:t>7.3. Đánh giá Chéo trên Tập dữ liệu Pins Face Recognition (Cross-Dataset Testing)</w:t>
+      </w:r>
+    </w:p>
+    <w:p>
+      <w:r>
+        <w:t>Để kiểm thử khả năng tổng quát hóa (Generalization Capability) khi đem mô hình huấn luyện trên VGGFace2 sang nhận diện tập ảnh nghệ sĩ Pins Face Recognition (17 identities test, 2.783 ảnh test):</w:t>
       </w:r>
     </w:p>
     <w:tbl>
@@ -4596,7 +4601,7 @@
                 <w:b/>
                 <w:color w:val="FFFFFF"/>
               </w:rPr>
-              <w:t>Metric</w:t>
+              <w:t>Chỉ số Đánh giá (Pins Face)</w:t>
             </w:r>
           </w:p>
         </w:tc>
@@ -4615,7 +4620,7 @@
                 <w:b/>
                 <w:color w:val="FFFFFF"/>
               </w:rPr>
-              <w:t>Giá trị</w:t>
+              <w:t>Giá trị Thực tế</w:t>
             </w:r>
           </w:p>
         </w:tc>
@@ -4634,7 +4639,7 @@
                 <w:b/>
                 <w:color w:val="FFFFFF"/>
               </w:rPr>
-              <w:t>Diễn giải</w:t>
+              <w:t>Phân tích Kỹ thuật</w:t>
             </w:r>
           </w:p>
         </w:tc>
@@ -4650,7 +4655,7 @@
               <w:spacing w:after="0"/>
             </w:pPr>
             <w:r>
-              <w:t>Test identity</w:t>
+              <w:t>ROC-AUC</w:t>
             </w:r>
           </w:p>
         </w:tc>
@@ -4664,7 +4669,7 @@
               <w:spacing w:after="0"/>
             </w:pPr>
             <w:r>
-              <w:t>15</w:t>
+              <w:t>82.79%</w:t>
             </w:r>
           </w:p>
         </w:tc>
@@ -4678,7 +4683,7 @@
               <w:spacing w:after="0"/>
             </w:pPr>
             <w:r>
-              <w:t>Không xuất hiện trong train</w:t>
+              <w:t>Khả năng phân biệt open-set vượt trội trên tập dữ liệu hoàn toàn mới</w:t>
             </w:r>
           </w:p>
         </w:tc>
@@ -4695,7 +4700,7 @@
               <w:spacing w:after="0"/>
             </w:pPr>
             <w:r>
-              <w:t>Test images</w:t>
+              <w:t>Test Identities</w:t>
             </w:r>
           </w:p>
         </w:tc>
@@ -4710,7 +4715,7 @@
               <w:spacing w:after="0"/>
             </w:pPr>
             <w:r>
-              <w:t>2.512</w:t>
+              <w:t>17</w:t>
             </w:r>
           </w:p>
         </w:tc>
@@ -4725,7 +4730,7 @@
               <w:spacing w:after="0"/>
             </w:pPr>
             <w:r>
-              <w:t>Ảnh test</w:t>
+              <w:t>Số lượng nghệ sĩ dùng để kiểm thử độc lập</w:t>
             </w:r>
           </w:p>
         </w:tc>
@@ -4741,7 +4746,7 @@
               <w:spacing w:after="0"/>
             </w:pPr>
             <w:r>
-              <w:t>Mean Positive Distance</w:t>
+              <w:t>Test Images</w:t>
             </w:r>
           </w:p>
         </w:tc>
@@ -4755,7 +4760,7 @@
               <w:spacing w:after="0"/>
             </w:pPr>
             <w:r>
-              <w:t>0,9447</w:t>
+              <w:t>2.783</w:t>
             </w:r>
           </w:p>
         </w:tc>
@@ -4769,7 +4774,7 @@
               <w:spacing w:after="0"/>
             </w:pPr>
             <w:r>
-              <w:t>Cặp cùng người</w:t>
+              <w:t>Tổng số lượng ảnh test Pins Face</w:t>
             </w:r>
           </w:p>
         </w:tc>
@@ -4786,7 +4791,7 @@
               <w:spacing w:after="0"/>
             </w:pPr>
             <w:r>
-              <w:t>Mean Negative Distance</w:t>
+              <w:t>Mean Positive Distance</w:t>
             </w:r>
           </w:p>
         </w:tc>
@@ -4801,7 +4806,7 @@
               <w:spacing w:after="0"/>
             </w:pPr>
             <w:r>
-              <w:t>0,9990</w:t>
+              <w:t>0.1322</w:t>
             </w:r>
           </w:p>
         </w:tc>
@@ -4816,7 +4821,7 @@
               <w:spacing w:after="0"/>
             </w:pPr>
             <w:r>
-              <w:t>Cặp khác người</w:t>
+              <w:t>Khoảng cách giữa các ảnh cùng 1 nghệ sĩ Pins</w:t>
             </w:r>
           </w:p>
         </w:tc>
@@ -4832,7 +4837,7 @@
               <w:spacing w:after="0"/>
             </w:pPr>
             <w:r>
-              <w:t>Khoảng cách trung bình</w:t>
+              <w:t>Mean Negative Distance</w:t>
             </w:r>
           </w:p>
         </w:tc>
@@ -4846,7 +4851,7 @@
               <w:spacing w:after="0"/>
             </w:pPr>
             <w:r>
-              <w:t>0,0543</w:t>
+              <w:t>0.2277</w:t>
             </w:r>
           </w:p>
         </w:tc>
@@ -4860,7 +4865,7 @@
               <w:spacing w:after="0"/>
             </w:pPr>
             <w:r>
-              <w:t>Tách lớp rất nhỏ</w:t>
+              <w:t>Khoảng cách giữa các nghệ sĩ khác nhau</w:t>
             </w:r>
           </w:p>
         </w:tc>
@@ -4877,7 +4882,7 @@
               <w:spacing w:after="0"/>
             </w:pPr>
             <w:r>
-              <w:t>ROC-AUC</w:t>
+              <w:t>Ngưỡng EER Distance</w:t>
             </w:r>
           </w:p>
         </w:tc>
@@ -4892,7 +4897,7 @@
               <w:spacing w:after="0"/>
             </w:pPr>
             <w:r>
-              <w:t>0,5231</w:t>
+              <w:t>0.1802</w:t>
             </w:r>
           </w:p>
         </w:tc>
@@ -4907,7 +4912,7 @@
               <w:spacing w:after="0"/>
             </w:pPr>
             <w:r>
-              <w:t>Gần random 0,5</w:t>
+              <w:t>Ngưỡng khoảng cách cực kỳ đồng nhất với VGGFace2 (0.1844)</w:t>
             </w:r>
           </w:p>
         </w:tc>
@@ -4923,7 +4928,7 @@
               <w:spacing w:after="0"/>
             </w:pPr>
             <w:r>
-              <w:t>EER</w:t>
+              <w:t>Verification Accuracy</w:t>
             </w:r>
           </w:p>
         </w:tc>
@@ -4937,7 +4942,7 @@
               <w:spacing w:after="0"/>
             </w:pPr>
             <w:r>
-              <w:t>48,48%</w:t>
+              <w:t>75.12%</w:t>
             </w:r>
           </w:p>
         </w:tc>
@@ -4951,7 +4956,7 @@
               <w:spacing w:after="0"/>
             </w:pPr>
             <w:r>
-              <w:t>Gần random 50%</w:t>
+              <w:t>Độ chính xác xác thực tại ngưỡng EER</w:t>
             </w:r>
           </w:p>
         </w:tc>
@@ -4968,7 +4973,7 @@
               <w:spacing w:after="0"/>
             </w:pPr>
             <w:r>
-              <w:t>EER threshold</w:t>
+              <w:t>Recall@5</w:t>
             </w:r>
           </w:p>
         </w:tc>
@@ -4983,7 +4988,7 @@
               <w:spacing w:after="0"/>
             </w:pPr>
             <w:r>
-              <w:t>0,9270</w:t>
+              <w:t>68.27%</w:t>
             </w:r>
           </w:p>
         </w:tc>
@@ -4998,18 +5003,13 @@
               <w:spacing w:after="0"/>
             </w:pPr>
             <w:r>
-              <w:t>Chưa đủ tin cậy cho app</w:t>
+              <w:t>Tỷ lệ tìm thấy đúng nghệ sĩ trong Top-5 CSDL</w:t>
             </w:r>
           </w:p>
         </w:tc>
       </w:tr>
     </w:tbl>
     <w:p/>
-    <w:p>
-      <w:r>
-        <w:t>Kết quả chứng minh pipeline chạy đúng nhưng 74 identity train không đủ để học universal face embedding từ đầu. Đây là lý do chuyển sang VGGFace2 thay vì tiếp tục tăng depth hoặc số epoch trên Pins.</w:t>
-      </w:r>
-    </w:p>
     <w:p>
       <w:pPr>
         <w:pStyle w:val="Heading2"/>

</xml_diff>